<commit_message>
new requirements.txt & modify dependencies
</commit_message>
<xml_diff>
--- a/docs/Generated_paper/original_grammar_questions/test_grammar_1_['～たら〈〉(条件) ']_generated.docx
+++ b/docs/Generated_paper/original_grammar_questions/test_grammar_1_['～たら〈〉(条件) ']_generated.docx
@@ -10,9 +10,9 @@
         <w:t>Q1: もんだい1</w:t>
       </w:r>
       <w:r>
-        <w:t>きのうはえいがをみました。それから、うちにかえったら、すぐねました。</w:t>
+        <w:t>毎朝、（ ）歯を磨きます。</w:t>
         <w:br/>
-        <w:t>1. かえると 2. かえって 3. かえれば 4. かえったら</w:t>
+        <w:t>1. 起きると 2. 起きれば 3. 起きるたら 4. 起きたら</w:t>
         <w:br/>
         <w:t>Answer: 4</w:t>
       </w:r>
@@ -23,9 +23,9 @@
         <w:t>Q2: もんだい1</w:t>
       </w:r>
       <w:r>
-        <w:t>あしたあめがふったら、テニスのれんしゅうをやめます。</w:t>
+        <w:t>傘を持っていきません。雨が（ ）。</w:t>
         <w:br/>
-        <w:t>1. ふると 2. ふって 3. ふれば 4. ふったら</w:t>
+        <w:t>1. 降ると 2. 降れば 3. 降るたら 4. 降ったら</w:t>
         <w:br/>
         <w:t>Answer: 4</w:t>
       </w:r>
@@ -36,11 +36,11 @@
         <w:t>Q3: もんだい1</w:t>
       </w:r>
       <w:r>
-        <w:t>スーパーでりんごをかったら、みかんもかったので、とてもたべすぎました。</w:t>
+        <w:t>宿題が（ ）、テレビを見ます。</w:t>
         <w:br/>
-        <w:t>1. かったと 2. かって 3. かったら 4. かったれば</w:t>
+        <w:t>1. 終わると 2. 終われば 3. 終わるたら 4. 終わったら</w:t>
         <w:br/>
-        <w:t>Answer: 3</w:t>
+        <w:t>Answer: 4</w:t>
       </w:r>
       <w:r>
         <w:br/>
@@ -49,11 +49,11 @@
         <w:t>Q4: もんだい1</w:t>
       </w:r>
       <w:r>
-        <w:t>でんわがきたら、すぐでんわをとります。</w:t>
+        <w:t>友達に会（ ）、「こんにちは」と言います。</w:t>
         <w:br/>
-        <w:t>1. きたと 2. きて 3. きたら 4. きれば</w:t>
+        <w:t>1. うと 2. えば 3. うたら 4. ったら</w:t>
         <w:br/>
-        <w:t>Answer: 3</w:t>
+        <w:t>Answer: 4</w:t>
       </w:r>
       <w:r>
         <w:br/>
@@ -62,9 +62,9 @@
         <w:t>Q5: もんだい1</w:t>
       </w:r>
       <w:r>
-        <w:t>きょうはひるごはんをたべたら、ちょっとねむくなりました。</w:t>
+        <w:t>映画が始（ ）、静かにしてください。</w:t>
         <w:br/>
-        <w:t>1. たべると 2. たべって 3. たべれば 4. たべたら</w:t>
+        <w:t>1. まると 2. まれば 3. まるたら 4. まったら</w:t>
         <w:br/>
         <w:t>Answer: 4</w:t>
       </w:r>
@@ -75,11 +75,11 @@
         <w:t>Q6: もんだい1</w:t>
       </w:r>
       <w:r>
-        <w:t>えきまであるいたら、ゆうびんきょくにもよりたいです。</w:t>
+        <w:t>財布を（ ）、学校の事務室に持っていきます。</w:t>
         <w:br/>
-        <w:t>1. あるくと 2. あるいたら 3. あるけば 4. あるいたら</w:t>
+        <w:t>1. 見つけますと 2. 見つけれ 3. 見つけるたら 4. 見つけたら</w:t>
         <w:br/>
-        <w:t>Answer: 2</w:t>
+        <w:t>Answer: 4</w:t>
       </w:r>
       <w:r>
         <w:br/>
@@ -88,11 +88,11 @@
         <w:t>Q7: もんだい1</w:t>
       </w:r>
       <w:r>
-        <w:t>えきでともだちにであったら、いっしょにコーヒーをのむことにしましょう。</w:t>
+        <w:t>お腹が（ ）、昼ご飯を食べます。</w:t>
         <w:br/>
-        <w:t>1. であると 2. であって 3. であいたら 4. であえば</w:t>
+        <w:t>1. 空くと 2. 空けば 3. 空くたら 4. 空いたら</w:t>
         <w:br/>
-        <w:t>Answer: 3</w:t>
+        <w:t>Answer: 4</w:t>
       </w:r>
       <w:r>
         <w:br/>
@@ -101,9 +101,9 @@
         <w:t>Q8: もんだい1</w:t>
       </w:r>
       <w:r>
-        <w:t>せんしゅうテストがありました。もしもっとべんきょうしたら、いいてんがとれたかもしれません。</w:t>
+        <w:t>本を（ ）、友達に貸します。</w:t>
         <w:br/>
-        <w:t>1. べんきょうすると 2. べんきょうして 3. べんきょうすれば 4. べんきょうしたら</w:t>
+        <w:t>1. 買いますと 2. 買え 3. 買うたら 4. 買ったら</w:t>
         <w:br/>
         <w:t>Answer: 4</w:t>
       </w:r>
@@ -114,11 +114,11 @@
         <w:t>Q9: もんだい1</w:t>
       </w:r>
       <w:r>
-        <w:t>きのう、ともだちがうちにくるとしらなかったので、へやがきたなくてわるいことをしました。もしやすくしてたら、もっとよかったです。</w:t>
+        <w:t>あなたが（ ）、電話をかけました。</w:t>
         <w:br/>
-        <w:t>1. やすくする 2. やすくした 3. やすくしたら 4. やすくすれば</w:t>
+        <w:t>1. 見えない 2. 見なかったら 3. 見れなかったら 4. 見なかったら</w:t>
         <w:br/>
-        <w:t>Answer: 2</w:t>
+        <w:t>Answer: 4</w:t>
       </w:r>
       <w:r>
         <w:br/>
@@ -127,9 +127,9 @@
         <w:t>Q10: もんだい1</w:t>
       </w:r>
       <w:r>
-        <w:t>せんしゅうからびょうきでした。もしやくをのんだら、きょねんよりはやくけあとりました。</w:t>
+        <w:t>給料を（ ）、プレゼントを買います。</w:t>
         <w:br/>
-        <w:t>1. のむと 2. のんで 3. のめば 4. のんだら</w:t>
+        <w:t>1. もらうと 2. もらえ 3. もらうたら 4. もらったら</w:t>
         <w:br/>
         <w:t>Answer: 4</w:t>
         <w:br/>
@@ -142,9 +142,9 @@
         <w:t>Q11: もんだい2</w:t>
       </w:r>
       <w:r>
-        <w:t>明日の天気予報を見たら、雨が( )、ピクニックを中止にします。</w:t>
+        <w:t>スーパーでかばんを()、さいふがありませんでした。</w:t>
         <w:br/>
-        <w:t>1. 降る 2. 降ったら 3. 降ると 4. 降った</w:t>
+        <w:t>1. 見つけたら 2. 見つけないと 3. 見つければ 4. 見つけたり</w:t>
         <w:br/>
         <w:t>Answer: 1</w:t>
       </w:r>
@@ -155,11 +155,11 @@
         <w:t>Q12: もんだい2</w:t>
       </w:r>
       <w:r>
-        <w:t>デパートで靴を( )、お会計をしてください。</w:t>
+        <w:t>えきでともだちに()、いっしょにコーヒーをのみました。</w:t>
         <w:br/>
-        <w:t>1. 見つけたら 2. 見つけると 3. 見つけたらて 4. 見つけた</w:t>
+        <w:t>1. 会うと 2. 会ったら 3. 会えば 4. 会ったり</w:t>
         <w:br/>
-        <w:t>Answer: 1</w:t>
+        <w:t>Answer: 2</w:t>
       </w:r>
       <w:r>
         <w:br/>
@@ -168,11 +168,11 @@
         <w:t>Q13: もんだい2</w:t>
       </w:r>
       <w:r>
-        <w:t>駅に着いたら、母に( )。</w:t>
+        <w:t>でんわが()、じゅうしょをかえました。</w:t>
         <w:br/>
-        <w:t>1. 電話します 2. 電話した 3. 電話する 4. 電話して</w:t>
+        <w:t>1. 鳴ると 2. 鳴れば 3. 鳴ったら 4. 鳴ったり</w:t>
         <w:br/>
-        <w:t>Answer: 1</w:t>
+        <w:t>Answer: 3</w:t>
       </w:r>
       <w:r>
         <w:br/>
@@ -181,11 +181,11 @@
         <w:t>Q14: もんだい2</w:t>
       </w:r>
       <w:r>
-        <w:t>この薬を飲んだら、( )。</w:t>
+        <w:t>まいあさねむりが()、おそくおきます。</w:t>
         <w:br/>
-        <w:t>1. 熱が下がりました 2. 熱が下がる 3. 熱が下がって 4. 熱が下がり</w:t>
+        <w:t>1. 悪いと 2. 悪ければ 3. 悪かったら 4. 悪くたり</w:t>
         <w:br/>
-        <w:t>Answer: 2</w:t>
+        <w:t>Answer: 3</w:t>
       </w:r>
       <w:r>
         <w:br/>
@@ -194,11 +194,11 @@
         <w:t>Q15: もんだい2</w:t>
       </w:r>
       <w:r>
-        <w:t>スーパーで安売りを( )、友達に教えます。</w:t>
+        <w:t>あしたせんせいに()、こんにちはと言います。</w:t>
         <w:br/>
-        <w:t>1. 見つけたら 2. 見つけたなら 3. 見つけたらて 4. 見つけた</w:t>
+        <w:t>1. 会うと 2. 会えば 3. 会ったら 4. 会ったり</w:t>
         <w:br/>
-        <w:t>Answer: 1</w:t>
+        <w:t>Answer: 3</w:t>
       </w:r>
       <w:r>
         <w:br/>
@@ -207,11 +207,11 @@
         <w:t>Q16: もんだい2</w:t>
       </w:r>
       <w:r>
-        <w:t>友達が家に来たら、( )、一緒に映画を見ましょう。</w:t>
+        <w:t>このケーキを()、とてもおいしかったですよ。</w:t>
         <w:br/>
-        <w:t>1. 時間があったら 2. 時間があれば 3. 時間があった 4. 時間がなくて</w:t>
+        <w:t>1. 作ると 2. 作れば 3. 作ったら 4. 作ったり</w:t>
         <w:br/>
-        <w:t>Answer: 1</w:t>
+        <w:t>Answer: 3</w:t>
       </w:r>
       <w:r>
         <w:br/>
@@ -220,9 +220,9 @@
         <w:t>Q17: もんだい2</w:t>
       </w:r>
       <w:r>
-        <w:t>明日の試験が終わったら、( )。</w:t>
+        <w:t>えいがのよやくが()、メールで知らせてください。</w:t>
         <w:br/>
-        <w:t>1. 勉強します 2. 勉強した 3. 勉強する 4. 勉強して</w:t>
+        <w:t>1. できると 2. できれば 3. できたら 4. できたり</w:t>
         <w:br/>
         <w:t>Answer: 3</w:t>
       </w:r>
@@ -233,11 +233,11 @@
         <w:t>Q18: もんだい2</w:t>
       </w:r>
       <w:r>
-        <w:t>おばあちゃんが東京に( )、新幹線で迎えに行きます。</w:t>
+        <w:t>きのうてんきが()、びじゅつかんへ行きませんでした。</w:t>
         <w:br/>
-        <w:t>1. 来るたら 2. 来たら 3. 来ると 4. 来た</w:t>
+        <w:t>1. 悪いと 2. 悪ければ 3. 悪かったら 4. 悪くたり</w:t>
         <w:br/>
-        <w:t>Answer: 2</w:t>
+        <w:t>Answer: 3</w:t>
       </w:r>
       <w:r>
         <w:br/>
@@ -246,11 +246,11 @@
         <w:t>Q19: もんだい2</w:t>
       </w:r>
       <w:r>
-        <w:t>このスイッチを押したら、( )。だから触らないでください。</w:t>
+        <w:t>このメールを()、とてもよろこびます。</w:t>
         <w:br/>
-        <w:t>1. 火が出ました 2. 火が出る 3. 火が出た 4. 火が出して</w:t>
+        <w:t>1. 読むと 2. 読めば 3. 読んだら 4. 読んだり</w:t>
         <w:br/>
-        <w:t>Answer: 2</w:t>
+        <w:t>Answer: 3</w:t>
       </w:r>
       <w:r>
         <w:br/>
@@ -259,11 +259,11 @@
         <w:t>Q20: もんだい2</w:t>
       </w:r>
       <w:r>
-        <w:t>田中さんが駅に着いたら、( )。約束の時間は3時だから。</w:t>
+        <w:t>りょこうのゆうびんを()、またごれんらくください。</w:t>
         <w:br/>
-        <w:t>1. 待ち合わせを忘れた 2. 待ち合わせを忘れる 3. 待ち合わせを忘れて 4. 待ち合わせを忘れていた</w:t>
+        <w:t>1. 受け取ると 2. 受け取れば 3. 受け取ったら 4. 受け取ったり</w:t>
         <w:br/>
-        <w:t>Answer: 2</w:t>
+        <w:t>Answer: 3</w:t>
       </w:r>
       <w:r>
         <w:br/>

</xml_diff>

<commit_message>
Add voting machine (test version)
Add v4.1 based on the v3 (have not integrated v4); reconstruct the checking process of jap_question_generator.py
</commit_message>
<xml_diff>
--- a/docs/Generated_paper/original_grammar_questions/test_grammar_1_['～たら〈〉(条件) ']_generated.docx
+++ b/docs/Generated_paper/original_grammar_questions/test_grammar_1_['～たら〈〉(条件) ']_generated.docx
@@ -10,11 +10,11 @@
         <w:t>Q1: もんだい1</w:t>
       </w:r>
       <w:r>
-        <w:t>家に帰ったら、ご飯を( )。</w:t>
+        <w:t>きのうは おそく ねた（　　　）、 けさ おきたら もう ９じでした。</w:t>
         <w:br/>
-        <w:t>1. 食べたら 2. 食べるたら 3. 食べれば 4. 食べた</w:t>
+        <w:t>1. たら 2. なら 3. と 4. ば</w:t>
         <w:br/>
-        <w:t>Answer: 4</w:t>
+        <w:t>Answer: 1</w:t>
       </w:r>
       <w:r>
         <w:br/>
@@ -23,9 +23,9 @@
         <w:t>Q2: もんだい1</w:t>
       </w:r>
       <w:r>
-        <w:t>駅について( )、コンビニで切符を買います。</w:t>
+        <w:t>えきに つき（　　　）、 きっさてんで コーヒーを のみます。</w:t>
         <w:br/>
-        <w:t>1. たら 2. たらに 3. れば 4. た</w:t>
+        <w:t>1. たら 2. なら 3. と 4. ば</w:t>
         <w:br/>
         <w:t>Answer: 1</w:t>
       </w:r>
@@ -36,11 +36,11 @@
         <w:t>Q3: もんだい1</w:t>
       </w:r>
       <w:r>
-        <w:t>友達に会ったら、( )。</w:t>
+        <w:t>スーパーに 行（　　　）、 りんごを かって ください。</w:t>
         <w:br/>
-        <w:t>1. こんにちは言うたら 2. こんにちは言ったら 3. こんにちは言えば 4. こんにちは言った</w:t>
+        <w:t>1. いたら 2. いたら 3. いたら 4. いたら</w:t>
         <w:br/>
-        <w:t>Answer: 2</w:t>
+        <w:t>Answer: 1</w:t>
       </w:r>
       <w:r>
         <w:br/>
@@ -49,11 +49,11 @@
         <w:t>Q4: もんだい1</w:t>
       </w:r>
       <w:r>
-        <w:t>試験が終わったら、( )。</w:t>
+        <w:t>あした てんきが よく（　　　）、 こうえんに あそびに いきます。</w:t>
         <w:br/>
-        <w:t>1. 休みますたら 2. 休みますれば 3. 休みます 4. 休んだ</w:t>
+        <w:t>1. たら 2. なら 3. と 4. ば</w:t>
         <w:br/>
-        <w:t>Answer: 3</w:t>
+        <w:t>Answer: 1</w:t>
       </w:r>
       <w:r>
         <w:br/>
@@ -62,9 +62,9 @@
         <w:t>Q5: もんだい1</w:t>
       </w:r>
       <w:r>
-        <w:t>映画が( )、レストランに行きませんか。</w:t>
+        <w:t>ともだちと えいがを み（　　　）、 いえに かえりました。</w:t>
         <w:br/>
-        <w:t>1. 終わったら 2. 終わるたら 3. 終われば 4. 終わった</w:t>
+        <w:t>1. たら 2. たら 3. たら 4. たら</w:t>
         <w:br/>
         <w:t>Answer: 1</w:t>
       </w:r>
@@ -75,11 +75,11 @@
         <w:t>Q6: もんだい1</w:t>
       </w:r>
       <w:r>
-        <w:t>メールを( )、返事をください。</w:t>
+        <w:t>この くすりを のん（　　　）、 ちょっと よく なりました。</w:t>
         <w:br/>
-        <w:t>1. 見たら 2. 見るたら 3. 見れば 4. 見た</w:t>
+        <w:t>1. だら 2. たら 3. たり 4. たれ</w:t>
         <w:br/>
-        <w:t>Answer: 1</w:t>
+        <w:t>Answer: 2</w:t>
       </w:r>
       <w:r>
         <w:br/>
@@ -88,9 +88,9 @@
         <w:t>Q7: もんだい1</w:t>
       </w:r>
       <w:r>
-        <w:t>明日雨が( )、ピクニックをやめましょう。</w:t>
+        <w:t>でんしゃの きっぷを わすれ（　　　）、 あやまりました。</w:t>
         <w:br/>
-        <w:t>1. 降ったら 2. 降るたら 3. 降れば 4. 降った</w:t>
+        <w:t>1. たら 2. たら 3. たら 4. たら</w:t>
         <w:br/>
         <w:t>Answer: 1</w:t>
       </w:r>
@@ -101,9 +101,9 @@
         <w:t>Q8: もんだい1</w:t>
       </w:r>
       <w:r>
-        <w:t>この薬を( )、元気になりますよ。</w:t>
+        <w:t>かいものを す（　　　）、 ゆうはんを つくります。</w:t>
         <w:br/>
-        <w:t>1. 飲んだら 2. 飲むたら 3. 飲めば 4. 飲んだ</w:t>
+        <w:t>1. したら 2. するなら 3. してと 4. したば</w:t>
         <w:br/>
         <w:t>Answer: 1</w:t>
       </w:r>
@@ -114,11 +114,11 @@
         <w:t>Q9: もんだい1</w:t>
       </w:r>
       <w:r>
-        <w:t>道がわかりません。青い看板を( )、左に曲がってください。</w:t>
+        <w:t>きょねん にほんに きた（　　　）、 まだ にほんごが あまり わかりません。</w:t>
         <w:br/>
-        <w:t>1. 見たら 2. 見るたら 3. 見れば 4. 見た</w:t>
+        <w:t>1. たら 2. なら 3. と 4. ば</w:t>
         <w:br/>
-        <w:t>Answer: 1</w:t>
+        <w:t>Answer: 3</w:t>
       </w:r>
       <w:r>
         <w:br/>
@@ -127,11 +127,11 @@
         <w:t>Q10: もんだい1</w:t>
       </w:r>
       <w:r>
-        <w:t>空港に着いたら、母に電話を( )。</w:t>
+        <w:t>たなかさんに でんわを かけ（　　　）、 でかけて いました。</w:t>
         <w:br/>
-        <w:t>1. しなかったら 2. するたら 3. すれば 4. してください</w:t>
+        <w:t>1. たら 2. たら 3. たら 4. たら</w:t>
         <w:br/>
-        <w:t>Answer: 4</w:t>
+        <w:t>Answer: 1</w:t>
         <w:br/>
         <w:t>### Format 2</w:t>
       </w:r>
@@ -142,9 +142,9 @@
         <w:t>Q11: もんだい2</w:t>
       </w:r>
       <w:r>
-        <w:t>朝、目が覚めたら、すぐに ( )。</w:t>
+        <w:t>あした　天気が　いい（　　）、　公園で　ピクニックを　します。</w:t>
         <w:br/>
-        <w:t>1. 起きる 2. 起きよう 3. 起きようとした 4. 起きている</w:t>
+        <w:t>1. たら 2. れば 3. なら 4. ても</w:t>
         <w:br/>
         <w:t>Answer: 1</w:t>
       </w:r>
@@ -155,11 +155,11 @@
         <w:t>Q12: もんだい2</w:t>
       </w:r>
       <w:r>
-        <w:t>スーパーでパンを買ったら、牛乳も ( )。</w:t>
+        <w:t>コンビニで　ジュースを　買おうと　したら、（　　）。</w:t>
         <w:br/>
-        <w:t>1. 買います 2. 買おう 3. 買った 4. 買っている</w:t>
+        <w:t>1. お金が　なかった 2. お金が　あります 3. お金が　ありません 4. お金が　ありますか</w:t>
         <w:br/>
-        <w:t>Answer: 2</w:t>
+        <w:t>Answer: 1</w:t>
       </w:r>
       <w:r>
         <w:br/>
@@ -168,9 +168,9 @@
         <w:t>Q13: もんだい2</w:t>
       </w:r>
       <w:r>
-        <w:t>駅に着いたら、友達に ( )。</w:t>
+        <w:t>宿題が　終わり（　　）、　テレビを　見ても　いいですよ。</w:t>
         <w:br/>
-        <w:t>1. 電話する 2. 電話しよう 3. 電話した 4. 電話している</w:t>
+        <w:t>1. たら 2. れば 3. たら 4. たら</w:t>
         <w:br/>
         <w:t>Answer: 1</w:t>
       </w:r>
@@ -181,9 +181,9 @@
         <w:t>Q14: もんだい2</w:t>
       </w:r>
       <w:r>
-        <w:t>宿題が終わったら、テレビを ( )。</w:t>
+        <w:t>駅に　着いたら、（　　）。</w:t>
         <w:br/>
-        <w:t>1. 見る 2. 見よう 3. 見た 4. 見ている</w:t>
+        <w:t>1. お母さんに　電話を　します 2. お母さんに　電話を　しました 3. お母さんに　電話を　しますか 4. お母さんに　電話を　しません</w:t>
         <w:br/>
         <w:t>Answer: 1</w:t>
       </w:r>
@@ -194,11 +194,11 @@
         <w:t>Q15: もんだい2</w:t>
       </w:r>
       <w:r>
-        <w:t>明日雨が降ったら、ピクニックを ( )。</w:t>
+        <w:t>昨日、スーパーで　買い物を　したら、（　　）。</w:t>
         <w:br/>
-        <w:t>1. やめます 2. やめよう 3. やめた 4. やめている</w:t>
+        <w:t>1. 安いリンゴが　売っていました 2. 安いリンゴが　売っています 3. 安いリンゴが　売っていますか 4. 安いリンゴが　売りません</w:t>
         <w:br/>
-        <w:t>Answer: 2</w:t>
+        <w:t>Answer: 1</w:t>
       </w:r>
       <w:r>
         <w:br/>
@@ -207,11 +207,11 @@
         <w:t>Q16: もんだい2</w:t>
       </w:r>
       <w:r>
-        <w:t>銀行に行ったら、もう ( ) 閉まっていた。</w:t>
+        <w:t>電車に　乗ったら、（　　）。</w:t>
         <w:br/>
-        <w:t>1. 3時 2. 3時に 3. 3時で 4. 3時と</w:t>
+        <w:t>1. 窓から　景色が　見えました 2. 窓から　景色が　見えます 3. 窓から　景色が　見えません 4. 窓から　景色が　見えましょう</w:t>
         <w:br/>
-        <w:t>Answer: 2</w:t>
+        <w:t>Answer: 1</w:t>
       </w:r>
       <w:r>
         <w:br/>
@@ -220,11 +220,11 @@
         <w:t>Q17: もんだい2</w:t>
       </w:r>
       <w:r>
-        <w:t>メールを送ったら、すぐ ( ) 返事が来ました。</w:t>
+        <w:t>メールを　送ったら、（　　）。</w:t>
         <w:br/>
-        <w:t>1. に 2. が 3. で 4. と</w:t>
+        <w:t>1. 友だちが　すぐに　返事を　くれました 2. 友だちが　返事を　くれます 3. 友だちが　返事を　くれません 4. 友だちが　返事を　くれましょう</w:t>
         <w:br/>
-        <w:t>Answer: 2</w:t>
+        <w:t>Answer: 1</w:t>
       </w:r>
       <w:r>
         <w:br/>
@@ -233,9 +233,9 @@
         <w:t>Q18: もんだい2</w:t>
       </w:r>
       <w:r>
-        <w:t>昨日、駅で山田さんと会ったら、彼は ( ) いました。</w:t>
+        <w:t>この　薬を　飲んだら、（　　）。</w:t>
         <w:br/>
-        <w:t>1. 急いで 2. 急いでて 3. 急いでいた 4. 急ぐ</w:t>
+        <w:t>1. 体が　元気になりました 2. 体が　元気になります 3. 体が　元気になりません 4. 体が　元気になりましょう</w:t>
         <w:br/>
         <w:t>Answer: 1</w:t>
       </w:r>
@@ -246,11 +246,11 @@
         <w:t>Q19: もんだい2</w:t>
       </w:r>
       <w:r>
-        <w:t>「先週、田中さんの結婚式の話を聞いたら、びっくり ( )。」</w:t>
+        <w:t>先生が　教室に　はいってきた（　　）、　みんなで　「おはようございます」と　言います。</w:t>
         <w:br/>
-        <w:t>1. しました 2. していました 3. してしまいました 4. ししていました</w:t>
+        <w:t>1. たら 2. れば 3. なら 4. ても</w:t>
         <w:br/>
-        <w:t>Answer: 3</w:t>
+        <w:t>Answer: 1</w:t>
       </w:r>
       <w:r>
         <w:br/>
@@ -259,9 +259,9 @@
         <w:t>Q20: もんだい2</w:t>
       </w:r>
       <w:r>
-        <w:t>駅前のカフェで友達を見かけたら、昨日借りた本を ( )。</w:t>
+        <w:t>あなたの　メールを　もらった（　　）、　すぐに　返事を　書きました。</w:t>
         <w:br/>
-        <w:t>1. 忘れてしまった 2. 忘れている 3. 忘れよう 4. 忘れる</w:t>
+        <w:t>1. たら 2. れば 3. なら 4. ても</w:t>
         <w:br/>
         <w:t>Answer: 1</w:t>
       </w:r>

</xml_diff>

<commit_message>
Add Excel parsing and revision pipeline v3.1
Added parse_excel_to_text to jap_excel_processor.py for extracting question data from Excel files. Introduced jap_question_generator.v3.1(qwen based).py, implementing an Excel-based revision workflow for Japanese question generation and quality assurance.
</commit_message>
<xml_diff>
--- a/docs/Generated_paper/original_grammar_questions/test_grammar_1_['～たら〈〉(条件) ']_generated.docx
+++ b/docs/Generated_paper/original_grammar_questions/test_grammar_1_['～たら〈〉(条件) ']_generated.docx
@@ -10,9 +10,9 @@
         <w:t>Q1: もんだい1</w:t>
       </w:r>
       <w:r>
-        <w:t>きのうは おそく ねた（　　　）、 けさ おきたら もう ９じでした。</w:t>
+        <w:t>きょうはあめがふりました。 きのうはあめがふっていなかったので、えいがをみませんでした。( ) あめがふったからです。</w:t>
         <w:br/>
-        <w:t>1. たら 2. なら 3. と 4. ば</w:t>
+        <w:t>1. あめがふったら 2. あめがふる 3. あめがふるなら 4. あめがふった</w:t>
         <w:br/>
         <w:t>Answer: 1</w:t>
       </w:r>
@@ -23,11 +23,11 @@
         <w:t>Q2: もんだい1</w:t>
       </w:r>
       <w:r>
-        <w:t>えきに つき（　　　）、 きっさてんで コーヒーを のみます。</w:t>
+        <w:t>お母さんは「かんたんにできる」といいました。 そう( ) お手伝いをします。</w:t>
         <w:br/>
-        <w:t>1. たら 2. なら 3. と 4. ば</w:t>
+        <w:t>1. いえ 2. いえたら 3. いえば 4. いえたら</w:t>
         <w:br/>
-        <w:t>Answer: 1</w:t>
+        <w:t>Answer: 4</w:t>
       </w:r>
       <w:r>
         <w:br/>
@@ -36,11 +36,11 @@
         <w:t>Q3: もんだい1</w:t>
       </w:r>
       <w:r>
-        <w:t>スーパーに 行（　　　）、 りんごを かって ください。</w:t>
+        <w:t>たかしは がっこうを でました。 あの かおを みた( ) おなかが こわくなりました。</w:t>
         <w:br/>
-        <w:t>1. いたら 2. いたら 3. いたら 4. いたら</w:t>
+        <w:t>1. とき 2. とき 3. とき 4. とき</w:t>
         <w:br/>
-        <w:t>Answer: 1</w:t>
+        <w:t>Answer: 4</w:t>
       </w:r>
       <w:r>
         <w:br/>
@@ -49,9 +49,9 @@
         <w:t>Q4: もんだい1</w:t>
       </w:r>
       <w:r>
-        <w:t>あした てんきが よく（　　　）、 こうえんに あそびに いきます。</w:t>
+        <w:t>おやつをたべました。 おやつをたべ( ) えいがをみました。</w:t>
         <w:br/>
-        <w:t>1. たら 2. なら 3. と 4. ば</w:t>
+        <w:t>1. たら 2. た 3. る 4. たの</w:t>
         <w:br/>
         <w:t>Answer: 1</w:t>
       </w:r>
@@ -62,11 +62,11 @@
         <w:t>Q5: もんだい1</w:t>
       </w:r>
       <w:r>
-        <w:t>ともだちと えいがを み（　　　）、 いえに かえりました。</w:t>
+        <w:t>せんせいは「がくせいが しつもんを した( ) こたえます」といいました。</w:t>
         <w:br/>
-        <w:t>1. たら 2. たら 3. たら 4. たら</w:t>
+        <w:t>1. なら 2. たら 3. ば 4. なら</w:t>
         <w:br/>
-        <w:t>Answer: 1</w:t>
+        <w:t>Answer: 2</w:t>
       </w:r>
       <w:r>
         <w:br/>
@@ -75,9 +75,9 @@
         <w:t>Q6: もんだい1</w:t>
       </w:r>
       <w:r>
-        <w:t>この くすりを のん（　　　）、 ちょっと よく なりました。</w:t>
+        <w:t>いぬが おどりだした( ) おにいちゃんが おもちゃを あげました。</w:t>
         <w:br/>
-        <w:t>1. だら 2. たら 3. たり 4. たれ</w:t>
+        <w:t>1. と 2. たら 3. なら 4. ば</w:t>
         <w:br/>
         <w:t>Answer: 2</w:t>
       </w:r>
@@ -88,11 +88,11 @@
         <w:t>Q7: もんだい1</w:t>
       </w:r>
       <w:r>
-        <w:t>でんしゃの きっぷを わすれ（　　　）、 あやまりました。</w:t>
+        <w:t>しゅくだいを おわらせた( ) えいがを みました。</w:t>
         <w:br/>
-        <w:t>1. たら 2. たら 3. たら 4. たら</w:t>
+        <w:t>1. と 2. なら 3. たら 4. ば</w:t>
         <w:br/>
-        <w:t>Answer: 1</w:t>
+        <w:t>Answer: 3</w:t>
       </w:r>
       <w:r>
         <w:br/>
@@ -101,11 +101,11 @@
         <w:t>Q8: もんだい1</w:t>
       </w:r>
       <w:r>
-        <w:t>かいものを す（　　　）、 ゆうはんを つくります。</w:t>
+        <w:t>おねえさんが おきがえを した( ) あさごはんを たべました。</w:t>
         <w:br/>
-        <w:t>1. したら 2. するなら 3. してと 4. したば</w:t>
+        <w:t>1. と 2. たら 3. なら 4. ば</w:t>
         <w:br/>
-        <w:t>Answer: 1</w:t>
+        <w:t>Answer: 2</w:t>
       </w:r>
       <w:r>
         <w:br/>
@@ -114,9 +114,9 @@
         <w:t>Q9: もんだい1</w:t>
       </w:r>
       <w:r>
-        <w:t>きょねん にほんに きた（　　　）、 まだ にほんごが あまり わかりません。</w:t>
+        <w:t>でんわが なった( ) でんわを とりました。</w:t>
         <w:br/>
-        <w:t>1. たら 2. なら 3. と 4. ば</w:t>
+        <w:t>1. と 2. なら 3. たら 4. ば</w:t>
         <w:br/>
         <w:t>Answer: 3</w:t>
       </w:r>
@@ -127,11 +127,11 @@
         <w:t>Q10: もんだい1</w:t>
       </w:r>
       <w:r>
-        <w:t>たなかさんに でんわを かけ（　　　）、 でかけて いました。</w:t>
+        <w:t>あめがふった( ) ピクニックを キャンセルしました。</w:t>
         <w:br/>
-        <w:t>1. たら 2. たら 3. たら 4. たら</w:t>
+        <w:t>1. と 2. なら 3. たら 4. ば</w:t>
         <w:br/>
-        <w:t>Answer: 1</w:t>
+        <w:t>Answer: 3</w:t>
         <w:br/>
         <w:t>### Format 2</w:t>
       </w:r>
@@ -142,9 +142,9 @@
         <w:t>Q11: もんだい2</w:t>
       </w:r>
       <w:r>
-        <w:t>あした　天気が　いい（　　）、　公園で　ピクニックを　します。</w:t>
+        <w:t xml:space="preserve">雨が降ったら、( )。  </w:t>
         <w:br/>
-        <w:t>1. たら 2. れば 3. なら 4. ても</w:t>
+        <w:t xml:space="preserve">1. かえります 2. かえった 3. かえりたい 4. かえりません  </w:t>
         <w:br/>
         <w:t>Answer: 1</w:t>
       </w:r>
@@ -155,9 +155,9 @@
         <w:t>Q12: もんだい2</w:t>
       </w:r>
       <w:r>
-        <w:t>コンビニで　ジュースを　買おうと　したら、（　　）。</w:t>
+        <w:t xml:space="preserve">友達が来たら、( )。  </w:t>
         <w:br/>
-        <w:t>1. お金が　なかった 2. お金が　あります 3. お金が　ありません 4. お金が　ありますか</w:t>
+        <w:t xml:space="preserve">1. おもてなしします 2. おもてなししました 3. おもてなししたい 4. おもてなししません  </w:t>
         <w:br/>
         <w:t>Answer: 1</w:t>
       </w:r>
@@ -168,9 +168,9 @@
         <w:t>Q13: もんだい2</w:t>
       </w:r>
       <w:r>
-        <w:t>宿題が　終わり（　　）、　テレビを　見ても　いいですよ。</w:t>
+        <w:t xml:space="preserve">早く起きられたら、( )。  </w:t>
         <w:br/>
-        <w:t>1. たら 2. れば 3. たら 4. たら</w:t>
+        <w:t xml:space="preserve">1. がんばれます 2. がんばりました 3. がんばりたい 4. がんばりません  </w:t>
         <w:br/>
         <w:t>Answer: 1</w:t>
       </w:r>
@@ -181,9 +181,9 @@
         <w:t>Q14: もんだい2</w:t>
       </w:r>
       <w:r>
-        <w:t>駅に　着いたら、（　　）。</w:t>
+        <w:t xml:space="preserve">お母さんが帰ったら、( )。  </w:t>
         <w:br/>
-        <w:t>1. お母さんに　電話を　します 2. お母さんに　電話を　しました 3. お母さんに　電話を　しますか 4. お母さんに　電話を　しません</w:t>
+        <w:t xml:space="preserve">1. おやつを食べます 2. おやつを食べた 3. おやつを食べたい 4. おやつを食べません  </w:t>
         <w:br/>
         <w:t>Answer: 1</w:t>
       </w:r>
@@ -194,9 +194,9 @@
         <w:t>Q15: もんだい2</w:t>
       </w:r>
       <w:r>
-        <w:t>昨日、スーパーで　買い物を　したら、（　　）。</w:t>
+        <w:t xml:space="preserve">テストが終わったら、( )。  </w:t>
         <w:br/>
-        <w:t>1. 安いリンゴが　売っていました 2. 安いリンゴが　売っています 3. 安いリンゴが　売っていますか 4. 安いリンゴが　売りません</w:t>
+        <w:t xml:space="preserve">1. だいじょうぶです 2. だいじょうぶでした 3. だいじょうぶになりたい 4. だいじょうぶになりません  </w:t>
         <w:br/>
         <w:t>Answer: 1</w:t>
       </w:r>
@@ -207,9 +207,9 @@
         <w:t>Q16: もんだい2</w:t>
       </w:r>
       <w:r>
-        <w:t>電車に　乗ったら、（　　）。</w:t>
+        <w:t xml:space="preserve">時間がないときは、( )。  </w:t>
         <w:br/>
-        <w:t>1. 窓から　景色が　見えました 2. 窓から　景色が　見えます 3. 窓から　景色が　見えません 4. 窓から　景色が　見えましょう</w:t>
+        <w:t xml:space="preserve">1. あわてます 2. あわてました 3. あわてたい 4. あわてません  </w:t>
         <w:br/>
         <w:t>Answer: 1</w:t>
       </w:r>
@@ -220,9 +220,9 @@
         <w:t>Q17: もんだい2</w:t>
       </w:r>
       <w:r>
-        <w:t>メールを　送ったら、（　　）。</w:t>
+        <w:t xml:space="preserve">メールが届いたら、( )。  </w:t>
         <w:br/>
-        <w:t>1. 友だちが　すぐに　返事を　くれました 2. 友だちが　返事を　くれます 3. 友だちが　返事を　くれません 4. 友だちが　返事を　くれましょう</w:t>
+        <w:t xml:space="preserve">1. すぐに返信します 2. すぐに返信しました 3. すぐに返信したい 4. すぐに返信しません  </w:t>
         <w:br/>
         <w:t>Answer: 1</w:t>
       </w:r>
@@ -233,9 +233,9 @@
         <w:t>Q18: もんだい2</w:t>
       </w:r>
       <w:r>
-        <w:t>この　薬を　飲んだら、（　　）。</w:t>
+        <w:t xml:space="preserve">寒くなったら、( )。  </w:t>
         <w:br/>
-        <w:t>1. 体が　元気になりました 2. 体が　元気になります 3. 体が　元気になりません 4. 体が　元気になりましょう</w:t>
+        <w:t xml:space="preserve">1. コートを着ます 2. コートを着ました 3. コートを着たい 4. コートを着ません  </w:t>
         <w:br/>
         <w:t>Answer: 1</w:t>
       </w:r>
@@ -246,9 +246,9 @@
         <w:t>Q19: もんだい2</w:t>
       </w:r>
       <w:r>
-        <w:t>先生が　教室に　はいってきた（　　）、　みんなで　「おはようございます」と　言います。</w:t>
+        <w:t xml:space="preserve">この本を読んだら、( )。  </w:t>
         <w:br/>
-        <w:t>1. たら 2. れば 3. なら 4. ても</w:t>
+        <w:t xml:space="preserve">1. わかります 2. わかりました 3. わかりたい 4. わかりません  </w:t>
         <w:br/>
         <w:t>Answer: 1</w:t>
       </w:r>
@@ -259,9 +259,9 @@
         <w:t>Q20: もんだい2</w:t>
       </w:r>
       <w:r>
-        <w:t>あなたの　メールを　もらった（　　）、　すぐに　返事を　書きました。</w:t>
+        <w:t xml:space="preserve">今日、会議が終わったら、( )。  </w:t>
         <w:br/>
-        <w:t>1. たら 2. れば 3. なら 4. ても</w:t>
+        <w:t xml:space="preserve">1. みんなでご飯を食べます 2. みんなでご飯を食べました 3. みんなでご飯を食べたい 4. みんなでご飯を食べません  </w:t>
         <w:br/>
         <w:t>Answer: 1</w:t>
       </w:r>

</xml_diff>